<commit_message>
1.35.44 : versionnage semantique (source unique splash, badge dans l'aide) + icone micro -> menu calibration (micro actif, fs, selection). Banc rejoue OK.
</commit_message>
<xml_diff>
--- a/tests/Rapport_validation_DSP_sonometre_CETIM.docx
+++ b/tests/Rapport_validation_DSP_sonometre_CETIM.docx
@@ -75,7 +75,7 @@
           <w:sz w:val="26"/>
           <w:szCs w:val="26"/>
         </w:rPr>
-        <w:t xml:space="preserve">Application sonomètre / analyseur — V35.42</w:t>
+        <w:t xml:space="preserve">Application sonomètre / analyseur — 1.35.44</w:t>
       </w:r>
     </w:p>
     <w:p>
@@ -215,7 +215,7 @@
           <w:sz w:val="21"/>
           <w:szCs w:val="21"/>
         </w:rPr>
-        <w:t xml:space="preserve">Ce document décrit le banc de validation du traitement du signal de l'application sonomètre/analyseur CETIM (application web mono-fichier, V35.42), les méthodes de calcul implémentées, les références utilisées pour la validation et les résultats obtenus. Le banc est conçu pour être rejoué à l'identique après chaque évolution du code : il fait partie du dépôt de l'application (dossier tests/) et s'exécute en deux commandes.</w:t>
+        <w:t xml:space="preserve">Ce document décrit le banc de validation du traitement du signal de l'application sonomètre/analyseur CETIM (application web mono-fichier, 1.35.44), les méthodes de calcul implémentées, les références utilisées pour la validation et les résultats obtenus. Le banc est conçu pour être rejoué à l'identique après chaque évolution du code : il fait partie du dépôt de l'application (dossier tests/) et s'exécute en deux commandes.</w:t>
       </w:r>
     </w:p>
     <w:p>
@@ -752,7 +752,7 @@
           <w:sz w:val="21"/>
           <w:szCs w:val="21"/>
         </w:rPr>
-        <w:t xml:space="preserve">Bilan global : 61 / 61 tests dans les tolérances (exécution du 14/07/2026 16:42:01). Les tableaux ci-dessous reprennent chaque test avec la valeur mesurée sur le code extrait de l'application, la valeur attendue (référence analytique ou normative) et la tolérance retenue.</w:t>
+        <w:t xml:space="preserve">Bilan global : 61 / 61 tests dans les tolérances (exécution du 14/07/2026 16:53:21). Les tableaux ci-dessous reprennent chaque test avec la valeur mesurée sur le code extrait de l'application, la valeur attendue (référence analytique ou normative) et la tolérance retenue.</w:t>
       </w:r>
     </w:p>
     <w:p>
@@ -10005,7 +10005,7 @@
           <w:sz w:val="21"/>
           <w:szCs w:val="21"/>
         </w:rPr>
-        <w:t xml:space="preserve">Le traitement du signal de l'application V35.42 est validé sur l'ensemble des 61 points de contrôle du banc : normalisation spectrale exacte au sens de Parseval, pondérations A et C conformes aux valeurs IEC 61672-1 à mieux que 0,15 dB, banc de tiers d'octave conforme au gabarit IEC 61260-1 (0 dB à fc, −3 dB aux bornes, réjection &gt; 18 dB), intégration Leq énergétiquement exacte, constantes de temps Fast/Slow conformes, et localisation de raie à mieux que 0,01 bin. Les deux écarts identifiés (pondération C à 8 kHz, lecture du sommet de raie) sont quantifiés, expliqués et sans impact sur les indices exportés. Le banc, versionné avec l'application, rend cette validation reproductible à chaque évolution.</w:t>
+        <w:t xml:space="preserve">Le traitement du signal de l'application 1.35.44 est validé sur l'ensemble des 61 points de contrôle du banc : normalisation spectrale exacte au sens de Parseval, pondérations A et C conformes aux valeurs IEC 61672-1 à mieux que 0,15 dB, banc de tiers d'octave conforme au gabarit IEC 61260-1 (0 dB à fc, −3 dB aux bornes, réjection &gt; 18 dB), intégration Leq énergétiquement exacte, constantes de temps Fast/Slow conformes, et localisation de raie à mieux que 0,01 bin. Les deux écarts identifiés (pondération C à 8 kHz, lecture du sommet de raie) sont quantifiés, expliqués et sans impact sur les indices exportés. Le banc, versionné avec l'application, rend cette validation reproductible à chaque évolution.</w:t>
       </w:r>
     </w:p>
     <w:sectPr>
@@ -10178,7 +10178,7 @@
         <w:sz w:val="16"/>
         <w:szCs w:val="16"/>
       </w:rPr>
-      <w:t xml:space="preserve">	Validation du traitement du signal — sonomètre V35.42</w:t>
+      <w:t xml:space="preserve">	Validation du traitement du signal — sonomètre 1.35.44</w:t>
     </w:r>
   </w:p>
 </w:hdr>

</xml_diff>